<commit_message>
docs(frontend): corregir plantilla Word y validar adopción STR-465
</commit_message>
<xml_diff>
--- a/styleradar-frontend-v3/docs/plantillas/StyleRadar_Plantilla_Institucional_Editable_v1.docx
+++ b/styleradar-frontend-v3/docs/plantillas/StyleRadar_Plantilla_Institucional_Editable_v1.docx
@@ -232,11 +232,9 @@
       </w:r>
     </w:p>
     <w:p>
-      <w:r>
-        <w:br w:type="page"/>
-      </w:r>
-    </w:p>
-    <w:p>
+      <w:pPr>
+        <w:pageBreakBefore/>
+      </w:pPr>
       <w:r>
         <w:rPr>
           <w:rFonts w:ascii="Poppins" w:hAnsi="Poppins"/>
@@ -365,6 +363,9 @@
       </w:r>
     </w:p>
     <w:p>
+      <w:pPr>
+        <w:spacing w:after="0"/>
+      </w:pPr>
       <w:r>
         <w:drawing>
           <wp:inline xmlns:a="http://schemas.openxmlformats.org/drawingml/2006/main" xmlns:pic="http://schemas.openxmlformats.org/drawingml/2006/picture">
@@ -401,6 +402,9 @@
       </w:r>
     </w:p>
     <w:p>
+      <w:pPr>
+        <w:spacing w:after="0"/>
+      </w:pPr>
       <w:r>
         <w:rPr>
           <w:rFonts w:ascii="Poppins" w:hAnsi="Poppins"/>
@@ -412,11 +416,9 @@
       </w:r>
     </w:p>
     <w:p>
-      <w:r>
-        <w:br w:type="page"/>
-      </w:r>
-    </w:p>
-    <w:p>
+      <w:pPr>
+        <w:pageBreakBefore/>
+      </w:pPr>
       <w:r>
         <w:rPr>
           <w:rFonts w:ascii="Poppins" w:hAnsi="Poppins"/>
@@ -1267,7 +1269,7 @@
       <w:spacing w:after="180"/>
     </w:pPr>
     <w:rPr>
-      <w:rFonts w:ascii="Poppins" w:hAnsi="Poppins"/>
+      <w:rFonts w:ascii="Poppins" w:hAnsi="Poppins" w:cs="Poppins" w:eastAsia="Poppins"/>
       <w:color w:val="262626"/>
       <w:sz w:val="19"/>
     </w:rPr>
@@ -1331,7 +1333,7 @@
       <w:outlineLvl w:val="0"/>
     </w:pPr>
     <w:rPr>
-      <w:rFonts w:asciiTheme="majorHAnsi" w:eastAsiaTheme="majorEastAsia" w:hAnsiTheme="majorHAnsi" w:cstheme="majorBidi" w:ascii="Poppins" w:hAnsi="Poppins"/>
+      <w:rFonts w:ascii="Poppins" w:hAnsi="Poppins" w:cs="Poppins" w:eastAsia="Poppins"/>
       <w:b/>
       <w:bCs/>
       <w:color w:val="48119A"/>
@@ -1355,7 +1357,7 @@
       <w:outlineLvl w:val="1"/>
     </w:pPr>
     <w:rPr>
-      <w:rFonts w:asciiTheme="majorHAnsi" w:eastAsiaTheme="majorEastAsia" w:hAnsiTheme="majorHAnsi" w:cstheme="majorBidi" w:ascii="Poppins" w:hAnsi="Poppins"/>
+      <w:rFonts w:ascii="Poppins" w:hAnsi="Poppins" w:cs="Poppins" w:eastAsia="Poppins"/>
       <w:b/>
       <w:bCs/>
       <w:color w:val="262626"/>
@@ -1614,13 +1616,13 @@
     <w:rsid w:val="00FC693F"/>
     <w:pPr>
       <w:pBdr>
-        <w:bottom w:val="single" w:sz="8" w:space="4" w:color="4F81BD" w:themeColor="accent1"/>
+        <w:bottom w:val="single" w:sz="8" w:space="4" w:color="48119A"/>
       </w:pBdr>
       <w:spacing w:after="280" w:line="240" w:lineRule="auto" w:before="280"/>
       <w:contextualSpacing/>
     </w:pPr>
     <w:rPr>
-      <w:rFonts w:asciiTheme="majorHAnsi" w:eastAsiaTheme="majorEastAsia" w:hAnsiTheme="majorHAnsi" w:cstheme="majorBidi" w:ascii="Poppins" w:hAnsi="Poppins"/>
+      <w:rFonts w:ascii="Poppins" w:hAnsi="Poppins" w:cs="Poppins" w:eastAsia="Poppins"/>
       <w:b/>
       <w:color w:val="262626"/>
       <w:spacing w:val="5"/>

</xml_diff>